<commit_message>
Embed AWS architecture diagram in the Word project report.
Co-authored-by: Cursor <cursoragent@cursor.com>
</commit_message>
<xml_diff>
--- a/docs/AI-StudyHub-Complete-Project-Report.docx
+++ b/docs/AI-StudyHub-Complete-Project-Report.docx
@@ -373,6 +373,133 @@
           <w:color w:val="0F6F5C"/>
         </w:rPr>
         <w:t>4. Architecture Decisions</w:t>
+      </w:r>
+    </w:p>
+    <w:p>
+      <w:pPr>
+        <w:pStyle w:val="Heading2"/>
+      </w:pPr>
+      <w:r>
+        <w:rPr>
+          <w:color w:val="0B1724"/>
+        </w:rPr>
+        <w:t>4.0 AWS infrastructure overview diagram</w:t>
+      </w:r>
+    </w:p>
+    <w:p>
+      <w:r>
+        <w:rPr>
+          <w:rFonts w:ascii="Calibri" w:hAnsi="Calibri"/>
+          <w:b w:val="0"/>
+          <w:sz w:val="22"/>
+        </w:rPr>
+        <w:t>The diagram below shows the full AWS layout used for AI Study Hub: GitHub Actions CI/CD, Terraform state in S3, VPC networking, ALB path routing to client/server/Grafana, ECS Fargate services, EFS for SQLite, Secrets Manager for the Groq API key, CloudWatch logging and alarms, and the staging monitoring stack (YACE → Prometheus → Grafana) with SNS cost and reliability alerts.</w:t>
+      </w:r>
+    </w:p>
+    <w:p>
+      <w:pPr>
+        <w:jc w:val="center"/>
+      </w:pPr>
+      <w:r>
+        <w:drawing>
+          <wp:inline xmlns:a="http://schemas.openxmlformats.org/drawingml/2006/main" xmlns:pic="http://schemas.openxmlformats.org/drawingml/2006/picture">
+            <wp:extent cx="5943600" cy="3958530"/>
+            <wp:docPr id="1" name="Picture 1"/>
+            <wp:cNvGraphicFramePr>
+              <a:graphicFrameLocks noChangeAspect="1"/>
+            </wp:cNvGraphicFramePr>
+            <a:graphic>
+              <a:graphicData uri="http://schemas.openxmlformats.org/drawingml/2006/picture">
+                <pic:pic>
+                  <pic:nvPicPr>
+                    <pic:cNvPr id="0" name="aws-infrastructure-architecture.png"/>
+                    <pic:cNvPicPr/>
+                  </pic:nvPicPr>
+                  <pic:blipFill>
+                    <a:blip r:embed="rId9"/>
+                    <a:stretch>
+                      <a:fillRect/>
+                    </a:stretch>
+                  </pic:blipFill>
+                  <pic:spPr>
+                    <a:xfrm>
+                      <a:off x="0" y="0"/>
+                      <a:ext cx="5943600" cy="3958530"/>
+                    </a:xfrm>
+                    <a:prstGeom prst="rect"/>
+                  </pic:spPr>
+                </pic:pic>
+              </a:graphicData>
+            </a:graphic>
+          </wp:inline>
+        </w:drawing>
+      </w:r>
+    </w:p>
+    <w:p>
+      <w:pPr>
+        <w:jc w:val="center"/>
+      </w:pPr>
+      <w:r>
+        <w:rPr>
+          <w:i/>
+          <w:color w:val="5B6B7C"/>
+          <w:sz w:val="18"/>
+        </w:rPr>
+        <w:t>Figure 1. AI Study Hub — AWS Infrastructure (Terraform + CI/CD via GitHub Actions)</w:t>
+      </w:r>
+    </w:p>
+    <w:p>
+      <w:r>
+        <w:rPr>
+          <w:rFonts w:ascii="Calibri" w:hAnsi="Calibri"/>
+          <w:b/>
+          <w:sz w:val="22"/>
+        </w:rPr>
+        <w:t>Diagram legend (how to read the figure):</w:t>
+      </w:r>
+    </w:p>
+    <w:p>
+      <w:pPr>
+        <w:pStyle w:val="ListBullet"/>
+      </w:pPr>
+      <w:r>
+        <w:rPr>
+          <w:sz w:val="22"/>
+        </w:rPr>
+        <w:t>Solid black lines: user traffic (Internet → Route 53/DNS → ALB → target groups → ECS tasks).</w:t>
+      </w:r>
+    </w:p>
+    <w:p>
+      <w:pPr>
+        <w:pStyle w:val="ListBullet"/>
+      </w:pPr>
+      <w:r>
+        <w:rPr>
+          <w:sz w:val="22"/>
+        </w:rPr>
+        <w:t>Solid blue lines: internal data flow (ECR images, Secrets Manager, EFS SQLite mounts).</w:t>
+      </w:r>
+    </w:p>
+    <w:p>
+      <w:pPr>
+        <w:pStyle w:val="ListBullet"/>
+      </w:pPr>
+      <w:r>
+        <w:rPr>
+          <w:sz w:val="22"/>
+        </w:rPr>
+        <w:t>Dashed lines: logs, metrics, and access paths (CloudWatch, YACE, Prometheus, Grafana).</w:t>
+      </w:r>
+    </w:p>
+    <w:p>
+      <w:pPr>
+        <w:pStyle w:val="ListBullet"/>
+      </w:pPr>
+      <w:r>
+        <w:rPr>
+          <w:sz w:val="22"/>
+        </w:rPr>
+        <w:t>Orange lines: alerts and notifications (CloudWatch Alarms / AWS Budgets → SNS → email).</w:t>
       </w:r>
     </w:p>
     <w:p>

</xml_diff>